<commit_message>
fix: resolve mobile redirect loop and enforce mandatory be-kit onboarding
</commit_message>
<xml_diff>
--- a/PrecisionPerformance_Project_Plan.docx
+++ b/PrecisionPerformance_Project_Plan.docx
@@ -113,16 +113,77 @@
       </w:r>
     </w:p>
     <w:p>
+      <w:pPr>
+        <w:pStyle w:val="SubtitleCustom"/>
+        <w:jc w:val="center"/>
+      </w:pPr>
+      <w:r>
+        <w:t>8dec5dd4046780e1.vercel-dns-017.com.</w:t>
+      </w:r>
+    </w:p>
+    <w:p>
+      <w:pPr>
+        <w:pStyle w:val="SubtitleCustom"/>
+        <w:jc w:val="center"/>
+      </w:pPr>
+    </w:p>
+    <w:p>
+      <w:pPr>
+        <w:pStyle w:val="SubtitleCustom"/>
+        <w:jc w:val="center"/>
+      </w:pPr>
+    </w:p>
+    <w:p>
       <w:r>
         <w:br w:type="page"/>
       </w:r>
+      <w:r>
+        <w:rPr>
+          <w:noProof/>
+        </w:rPr>
+        <w:lastRenderedPageBreak/>
+        <w:drawing>
+          <wp:inline distT="0" distB="0" distL="0" distR="0" wp14:anchorId="0A43DDD7" wp14:editId="3FBE7D6C">
+            <wp:extent cx="6188710" cy="3689350"/>
+            <wp:effectExtent l="0" t="0" r="2540" b="6350"/>
+            <wp:docPr id="1031375223" name="Picture 1"/>
+            <wp:cNvGraphicFramePr>
+              <a:graphicFrameLocks xmlns:a="http://schemas.openxmlformats.org/drawingml/2006/main" noChangeAspect="1"/>
+            </wp:cNvGraphicFramePr>
+            <a:graphic xmlns:a="http://schemas.openxmlformats.org/drawingml/2006/main">
+              <a:graphicData uri="http://schemas.openxmlformats.org/drawingml/2006/picture">
+                <pic:pic xmlns:pic="http://schemas.openxmlformats.org/drawingml/2006/picture">
+                  <pic:nvPicPr>
+                    <pic:cNvPr id="1031375223" name=""/>
+                    <pic:cNvPicPr/>
+                  </pic:nvPicPr>
+                  <pic:blipFill>
+                    <a:blip r:embed="rId8"/>
+                    <a:stretch>
+                      <a:fillRect/>
+                    </a:stretch>
+                  </pic:blipFill>
+                  <pic:spPr>
+                    <a:xfrm>
+                      <a:off x="0" y="0"/>
+                      <a:ext cx="6188710" cy="3689350"/>
+                    </a:xfrm>
+                    <a:prstGeom prst="rect">
+                      <a:avLst/>
+                    </a:prstGeom>
+                  </pic:spPr>
+                </pic:pic>
+              </a:graphicData>
+            </a:graphic>
+          </wp:inline>
+        </w:drawing>
+      </w:r>
     </w:p>
     <w:p>
       <w:pPr>
         <w:pStyle w:val="Heading1"/>
       </w:pPr>
       <w:r>
-        <w:lastRenderedPageBreak/>
         <w:t>1. Executive Overview</w:t>
       </w:r>
     </w:p>
@@ -189,6 +250,7 @@
         <w:pStyle w:val="ListBullet"/>
       </w:pPr>
       <w:r>
+        <w:lastRenderedPageBreak/>
         <w:t>Treat the shop as a modular capability. Product ranges will change over time, so product and inventory workflows should not be tightly coupled to member logic.</w:t>
       </w:r>
     </w:p>
@@ -584,7 +646,6 @@
               <w:rPr>
                 <w:b/>
               </w:rPr>
-              <w:lastRenderedPageBreak/>
               <w:t>Background Services</w:t>
             </w:r>
           </w:p>
@@ -772,6 +833,7 @@
         <w:pStyle w:val="ListBullet"/>
       </w:pPr>
       <w:r>
+        <w:lastRenderedPageBreak/>
         <w:t>Use user-to-horse and user-to-stable relationships to control who can view or edit each record.</w:t>
       </w:r>
     </w:p>
@@ -793,7 +855,15 @@
     </w:p>
     <w:p>
       <w:r>
-        <w:t>At minimum, the Supabase schema should include the following major entities:</w:t>
+        <w:t xml:space="preserve">At minimum, the Supabase </w:t>
+      </w:r>
+      <w:proofErr w:type="gramStart"/>
+      <w:r>
+        <w:t>schema</w:t>
+      </w:r>
+      <w:proofErr w:type="gramEnd"/>
+      <w:r>
+        <w:t xml:space="preserve"> should include the following major entities:</w:t>
       </w:r>
     </w:p>
     <w:tbl>
@@ -1049,7 +1119,6 @@
               <w:rPr>
                 <w:b/>
               </w:rPr>
-              <w:lastRenderedPageBreak/>
               <w:t>track_sessions</w:t>
             </w:r>
           </w:p>
@@ -1109,7 +1178,15 @@
           </w:tcPr>
           <w:p>
             <w:r>
-              <w:t>Daily conditions including ambient temperature and weather notes.</w:t>
+              <w:t xml:space="preserve">Daily conditions </w:t>
+            </w:r>
+            <w:proofErr w:type="gramStart"/>
+            <w:r>
+              <w:t>including</w:t>
+            </w:r>
+            <w:proofErr w:type="gramEnd"/>
+            <w:r>
+              <w:t xml:space="preserve"> ambient temperature and weather notes.</w:t>
             </w:r>
           </w:p>
         </w:tc>
@@ -1299,6 +1376,7 @@
         <w:pStyle w:val="ListBullet"/>
       </w:pPr>
       <w:r>
+        <w:lastRenderedPageBreak/>
         <w:t>Confirm payment model: products only, subscriptions only, or a hybrid approach.</w:t>
       </w:r>
     </w:p>
@@ -1419,7 +1497,6 @@
         <w:pStyle w:val="ListBullet"/>
       </w:pPr>
       <w:r>
-        <w:lastRenderedPageBreak/>
         <w:t>Create the contact and enquiry flows.</w:t>
       </w:r>
     </w:p>
@@ -1580,6 +1657,7 @@
         <w:pStyle w:val="ListBullet"/>
       </w:pPr>
       <w:r>
+        <w:lastRenderedPageBreak/>
         <w:t>Support organisation-specific or premium custom tiers if needed.</w:t>
       </w:r>
     </w:p>
@@ -1652,7 +1730,15 @@
         <w:pStyle w:val="ListBullet"/>
       </w:pPr>
       <w:r>
-        <w:t>Add exports and printable reports where useful.</w:t>
+        <w:t xml:space="preserve">Add exports and printable reports </w:t>
+      </w:r>
+      <w:proofErr w:type="gramStart"/>
+      <w:r>
+        <w:t>where</w:t>
+      </w:r>
+      <w:proofErr w:type="gramEnd"/>
+      <w:r>
+        <w:t xml:space="preserve"> useful.</w:t>
       </w:r>
     </w:p>
     <w:p>
@@ -1700,7 +1786,6 @@
         <w:pStyle w:val="ListBullet"/>
       </w:pPr>
       <w:r>
-        <w:lastRenderedPageBreak/>
         <w:t>Use analytics and real user behaviour to prioritise the next development wave.</w:t>
       </w:r>
     </w:p>
@@ -1812,6 +1897,7 @@
         <w:pStyle w:val="Heading1"/>
       </w:pPr>
       <w:r>
+        <w:lastRenderedPageBreak/>
         <w:t>Appendix — Note on the Rewritten GEMINI.md</w:t>
       </w:r>
     </w:p>
@@ -1820,8 +1906,58 @@
         <w:t>A dedicated rewritten GEMINI.md was prepared separately as the orchestration framework for Precision Performance. This document complements that file by translating the strategy into a concrete project plan and phased delivery roadmap.</w:t>
       </w:r>
     </w:p>
+    <w:p/>
+    <w:p>
+      <w:hyperlink r:id="rId9" w:history="1">
+        <w:r>
+          <w:rPr>
+            <w:rStyle w:val="Hyperlink"/>
+          </w:rPr>
+          <w:t>https://supabase.com/dashboard/project/ukqncqjhnokxlvfifeyn/database/schemas</w:t>
+        </w:r>
+      </w:hyperlink>
+    </w:p>
+    <w:p/>
+    <w:p>
+      <w:r>
+        <w:t xml:space="preserve">Publishable key in </w:t>
+      </w:r>
+      <w:proofErr w:type="spellStart"/>
+      <w:r>
+        <w:t>supabase</w:t>
+      </w:r>
+      <w:proofErr w:type="spellEnd"/>
+      <w:r>
+        <w:t xml:space="preserve"> </w:t>
+      </w:r>
+      <w:r>
+        <w:br/>
+      </w:r>
+      <w:proofErr w:type="spellStart"/>
+      <w:r>
+        <w:t>APIdefault</w:t>
+      </w:r>
+      <w:proofErr w:type="spellEnd"/>
+      <w:r>
+        <w:t xml:space="preserve"> keys     </w:t>
+      </w:r>
+      <w:r>
+        <w:t>sb_publishable_wmrxHbhwlDVYc2MJEG0mFg_uGeqCBOs</w:t>
+      </w:r>
+    </w:p>
+    <w:p>
+      <w:r>
+        <w:t xml:space="preserve">Secret keys </w:t>
+      </w:r>
+      <w:r>
+        <w:t>sb_secret_k5FkmVE7vIkfUprt--Tnww_5Ew6_MyI</w:t>
+      </w:r>
+    </w:p>
+    <w:p/>
+    <w:p/>
+    <w:p/>
     <w:sectPr>
-      <w:footerReference w:type="default" r:id="rId8"/>
+      <w:footerReference w:type="default" r:id="rId10"/>
       <w:pgSz w:w="12240" w:h="15840"/>
       <w:pgMar w:top="1247" w:right="1247" w:bottom="1134" w:left="1247" w:header="720" w:footer="720" w:gutter="0"/>
       <w:cols w:space="720"/>
@@ -13521,6 +13657,29 @@
       <w:sz w:val="21"/>
     </w:rPr>
   </w:style>
+  <w:style w:type="character" w:styleId="Hyperlink">
+    <w:name w:val="Hyperlink"/>
+    <w:basedOn w:val="DefaultParagraphFont"/>
+    <w:uiPriority w:val="99"/>
+    <w:unhideWhenUsed/>
+    <w:rsid w:val="00603BA2"/>
+    <w:rPr>
+      <w:color w:val="0000FF" w:themeColor="hyperlink"/>
+      <w:u w:val="single"/>
+    </w:rPr>
+  </w:style>
+  <w:style w:type="character" w:styleId="UnresolvedMention">
+    <w:name w:val="Unresolved Mention"/>
+    <w:basedOn w:val="DefaultParagraphFont"/>
+    <w:uiPriority w:val="99"/>
+    <w:semiHidden/>
+    <w:unhideWhenUsed/>
+    <w:rsid w:val="00603BA2"/>
+    <w:rPr>
+      <w:color w:val="605E5C"/>
+      <w:shd w:val="clear" w:color="auto" w:fill="E1DFDD"/>
+    </w:rPr>
+  </w:style>
 </w:styles>
 </file>
 

</xml_diff>